<commit_message>
updata docP and added tuner docT
</commit_message>
<xml_diff>
--- a/SSA_upgrade/ssa_meeting_notes.docx
+++ b/SSA_upgrade/ssa_meeting_notes.docx
@@ -4,376 +4,1430 @@
   <w:body>
     <w:p>
       <w:pPr>
-        <w:pStyle w:val="Heading2"/>
-        <w:rPr>
-          <w:sz w:val="22"/>
-          <w:szCs w:val="22"/>
-        </w:rPr>
-      </w:pPr>
-      <w:r>
-        <w:rPr>
-          <w:sz w:val="22"/>
-          <w:szCs w:val="22"/>
-        </w:rPr>
-        <w:t>MEETING NOTES</w:t>
-      </w:r>
-    </w:p>
-    <w:p>
-      <w:pPr>
-        <w:rPr>
-          <w:sz w:val="22"/>
-          <w:szCs w:val="22"/>
-        </w:rPr>
-      </w:pPr>
-      <w:r>
-        <w:rPr>
-          <w:sz w:val="22"/>
-          <w:szCs w:val="22"/>
-        </w:rPr>
-        <w:t>March 10, 2026</w:t>
-      </w:r>
-    </w:p>
-    <w:p>
-      <w:pPr>
-        <w:rPr>
-          <w:sz w:val="22"/>
-          <w:szCs w:val="22"/>
-        </w:rPr>
-      </w:pPr>
-      <w:r>
-        <w:rPr>
-          <w:sz w:val="22"/>
-          <w:szCs w:val="22"/>
-        </w:rPr>
-        <w:t>Attendees: Javier, Jim, Andi, Rob, Faya</w:t>
-      </w:r>
-      <w:r>
-        <w:rPr>
-          <w:sz w:val="22"/>
-          <w:szCs w:val="22"/>
-        </w:rPr>
-        <w:t>, Xiaobiao, Kira</w:t>
-      </w:r>
-    </w:p>
-    <w:p>
-      <w:pPr>
+        <w:spacing w:after="40"/>
+        <w:jc w:val="center"/>
+        <w:rPr>
+          <w:sz w:val="22"/>
+          <w:szCs w:val="22"/>
+        </w:rPr>
+      </w:pPr>
+      <w:r>
         <w:rPr>
           <w:b/>
           <w:bCs/>
-          <w:sz w:val="22"/>
-          <w:szCs w:val="22"/>
-        </w:rPr>
-      </w:pPr>
-      <w:r>
+          <w:color w:val="1F4E79"/>
+          <w:sz w:val="22"/>
+          <w:szCs w:val="22"/>
+        </w:rPr>
+        <w:t>MEETING NOTES</w:t>
+      </w:r>
+    </w:p>
+    <w:p>
+      <w:pPr>
+        <w:spacing w:after="40"/>
+        <w:jc w:val="center"/>
+        <w:rPr>
+          <w:sz w:val="22"/>
+          <w:szCs w:val="22"/>
+        </w:rPr>
+      </w:pPr>
+      <w:r>
+        <w:rPr>
+          <w:color w:val="2E75B6"/>
+          <w:sz w:val="22"/>
+          <w:szCs w:val="22"/>
+        </w:rPr>
+        <w:t>SPEAR SSA Upgrade — Infrastructure, Waveguide Layout &amp; Cost Estimating</w:t>
+      </w:r>
+    </w:p>
+    <w:tbl>
+      <w:tblPr>
+        <w:tblW w:w="9414" w:type="dxa"/>
+        <w:tblBorders>
+          <w:top w:val="single" w:sz="4" w:space="0" w:color="auto"/>
+          <w:left w:val="single" w:sz="4" w:space="0" w:color="auto"/>
+          <w:bottom w:val="single" w:sz="4" w:space="0" w:color="auto"/>
+          <w:right w:val="single" w:sz="4" w:space="0" w:color="auto"/>
+          <w:insideH w:val="single" w:sz="4" w:space="0" w:color="auto"/>
+          <w:insideV w:val="single" w:sz="4" w:space="0" w:color="auto"/>
+        </w:tblBorders>
+        <w:tblCellMar>
+          <w:left w:w="10" w:type="dxa"/>
+          <w:right w:w="10" w:type="dxa"/>
+        </w:tblCellMar>
+        <w:tblLook w:val="0000" w:firstRow="0" w:lastRow="0" w:firstColumn="0" w:lastColumn="0" w:noHBand="0" w:noVBand="0"/>
+      </w:tblPr>
+      <w:tblGrid>
+        <w:gridCol w:w="1810"/>
+        <w:gridCol w:w="7604"/>
+      </w:tblGrid>
+      <w:tr>
+        <w:trPr>
+          <w:trHeight w:val="329"/>
+        </w:trPr>
+        <w:tc>
+          <w:tcPr>
+            <w:tcW w:w="1810" w:type="dxa"/>
+            <w:tcBorders>
+              <w:top w:val="single" w:sz="1" w:space="0" w:color="CCCCCC"/>
+              <w:left w:val="single" w:sz="1" w:space="0" w:color="CCCCCC"/>
+              <w:bottom w:val="single" w:sz="1" w:space="0" w:color="CCCCCC"/>
+              <w:right w:val="single" w:sz="1" w:space="0" w:color="CCCCCC"/>
+            </w:tcBorders>
+            <w:shd w:val="clear" w:color="auto" w:fill="D6E4F0"/>
+            <w:tcMar>
+              <w:top w:w="60" w:type="dxa"/>
+              <w:left w:w="100" w:type="dxa"/>
+              <w:bottom w:w="60" w:type="dxa"/>
+              <w:right w:w="100" w:type="dxa"/>
+            </w:tcMar>
+          </w:tcPr>
+          <w:p>
+            <w:pPr>
+              <w:rPr>
+                <w:sz w:val="22"/>
+                <w:szCs w:val="22"/>
+              </w:rPr>
+            </w:pPr>
+            <w:r>
+              <w:rPr>
+                <w:b/>
+                <w:bCs/>
+                <w:sz w:val="22"/>
+                <w:szCs w:val="22"/>
+              </w:rPr>
+              <w:t>Date</w:t>
+            </w:r>
+          </w:p>
+        </w:tc>
+        <w:tc>
+          <w:tcPr>
+            <w:tcW w:w="7604" w:type="dxa"/>
+            <w:tcBorders>
+              <w:top w:val="single" w:sz="1" w:space="0" w:color="CCCCCC"/>
+              <w:left w:val="single" w:sz="1" w:space="0" w:color="CCCCCC"/>
+              <w:bottom w:val="single" w:sz="1" w:space="0" w:color="CCCCCC"/>
+              <w:right w:val="single" w:sz="1" w:space="0" w:color="CCCCCC"/>
+            </w:tcBorders>
+            <w:tcMar>
+              <w:top w:w="60" w:type="dxa"/>
+              <w:left w:w="100" w:type="dxa"/>
+              <w:bottom w:w="60" w:type="dxa"/>
+              <w:right w:w="100" w:type="dxa"/>
+            </w:tcMar>
+          </w:tcPr>
+          <w:p>
+            <w:pPr>
+              <w:rPr>
+                <w:sz w:val="22"/>
+                <w:szCs w:val="22"/>
+              </w:rPr>
+            </w:pPr>
+            <w:r>
+              <w:rPr>
+                <w:sz w:val="22"/>
+                <w:szCs w:val="22"/>
+              </w:rPr>
+              <w:t>March 24, 2026</w:t>
+            </w:r>
+          </w:p>
+        </w:tc>
+      </w:tr>
+      <w:tr>
+        <w:trPr>
+          <w:trHeight w:val="320"/>
+        </w:trPr>
+        <w:tc>
+          <w:tcPr>
+            <w:tcW w:w="1810" w:type="dxa"/>
+            <w:tcBorders>
+              <w:top w:val="single" w:sz="1" w:space="0" w:color="CCCCCC"/>
+              <w:left w:val="single" w:sz="1" w:space="0" w:color="CCCCCC"/>
+              <w:bottom w:val="single" w:sz="1" w:space="0" w:color="CCCCCC"/>
+              <w:right w:val="single" w:sz="1" w:space="0" w:color="CCCCCC"/>
+            </w:tcBorders>
+            <w:shd w:val="clear" w:color="auto" w:fill="D6E4F0"/>
+            <w:tcMar>
+              <w:top w:w="60" w:type="dxa"/>
+              <w:left w:w="100" w:type="dxa"/>
+              <w:bottom w:w="60" w:type="dxa"/>
+              <w:right w:w="100" w:type="dxa"/>
+            </w:tcMar>
+          </w:tcPr>
+          <w:p>
+            <w:pPr>
+              <w:rPr>
+                <w:sz w:val="22"/>
+                <w:szCs w:val="22"/>
+              </w:rPr>
+            </w:pPr>
+            <w:r>
+              <w:rPr>
+                <w:b/>
+                <w:bCs/>
+                <w:sz w:val="22"/>
+                <w:szCs w:val="22"/>
+              </w:rPr>
+              <w:t>Duration</w:t>
+            </w:r>
+          </w:p>
+        </w:tc>
+        <w:tc>
+          <w:tcPr>
+            <w:tcW w:w="7604" w:type="dxa"/>
+            <w:tcBorders>
+              <w:top w:val="single" w:sz="1" w:space="0" w:color="CCCCCC"/>
+              <w:left w:val="single" w:sz="1" w:space="0" w:color="CCCCCC"/>
+              <w:bottom w:val="single" w:sz="1" w:space="0" w:color="CCCCCC"/>
+              <w:right w:val="single" w:sz="1" w:space="0" w:color="CCCCCC"/>
+            </w:tcBorders>
+            <w:tcMar>
+              <w:top w:w="60" w:type="dxa"/>
+              <w:left w:w="100" w:type="dxa"/>
+              <w:bottom w:w="60" w:type="dxa"/>
+              <w:right w:w="100" w:type="dxa"/>
+            </w:tcMar>
+          </w:tcPr>
+          <w:p>
+            <w:pPr>
+              <w:rPr>
+                <w:sz w:val="22"/>
+                <w:szCs w:val="22"/>
+              </w:rPr>
+            </w:pPr>
+            <w:r>
+              <w:rPr>
+                <w:sz w:val="22"/>
+                <w:szCs w:val="22"/>
+              </w:rPr>
+              <w:t xml:space="preserve">~1.5 </w:t>
+            </w:r>
+            <w:proofErr w:type="spellStart"/>
+            <w:r>
+              <w:rPr>
+                <w:sz w:val="22"/>
+                <w:szCs w:val="22"/>
+              </w:rPr>
+              <w:t>hrs</w:t>
+            </w:r>
+            <w:proofErr w:type="spellEnd"/>
+          </w:p>
+        </w:tc>
+      </w:tr>
+      <w:tr>
+        <w:trPr>
+          <w:trHeight w:val="320"/>
+        </w:trPr>
+        <w:tc>
+          <w:tcPr>
+            <w:tcW w:w="1810" w:type="dxa"/>
+            <w:tcBorders>
+              <w:top w:val="single" w:sz="1" w:space="0" w:color="CCCCCC"/>
+              <w:left w:val="single" w:sz="1" w:space="0" w:color="CCCCCC"/>
+              <w:bottom w:val="single" w:sz="1" w:space="0" w:color="CCCCCC"/>
+              <w:right w:val="single" w:sz="1" w:space="0" w:color="CCCCCC"/>
+            </w:tcBorders>
+            <w:shd w:val="clear" w:color="auto" w:fill="D6E4F0"/>
+            <w:tcMar>
+              <w:top w:w="60" w:type="dxa"/>
+              <w:left w:w="100" w:type="dxa"/>
+              <w:bottom w:w="60" w:type="dxa"/>
+              <w:right w:w="100" w:type="dxa"/>
+            </w:tcMar>
+          </w:tcPr>
+          <w:p>
+            <w:pPr>
+              <w:rPr>
+                <w:sz w:val="22"/>
+                <w:szCs w:val="22"/>
+              </w:rPr>
+            </w:pPr>
+            <w:r>
+              <w:rPr>
+                <w:b/>
+                <w:bCs/>
+                <w:sz w:val="22"/>
+                <w:szCs w:val="22"/>
+              </w:rPr>
+              <w:t>Attendees</w:t>
+            </w:r>
+          </w:p>
+        </w:tc>
+        <w:tc>
+          <w:tcPr>
+            <w:tcW w:w="7604" w:type="dxa"/>
+            <w:tcBorders>
+              <w:top w:val="single" w:sz="1" w:space="0" w:color="CCCCCC"/>
+              <w:left w:val="single" w:sz="1" w:space="0" w:color="CCCCCC"/>
+              <w:bottom w:val="single" w:sz="1" w:space="0" w:color="CCCCCC"/>
+              <w:right w:val="single" w:sz="1" w:space="0" w:color="CCCCCC"/>
+            </w:tcBorders>
+            <w:tcMar>
+              <w:top w:w="60" w:type="dxa"/>
+              <w:left w:w="100" w:type="dxa"/>
+              <w:bottom w:w="60" w:type="dxa"/>
+              <w:right w:w="100" w:type="dxa"/>
+            </w:tcMar>
+          </w:tcPr>
+          <w:p>
+            <w:pPr>
+              <w:rPr>
+                <w:sz w:val="22"/>
+                <w:szCs w:val="22"/>
+              </w:rPr>
+            </w:pPr>
+            <w:r>
+              <w:rPr>
+                <w:sz w:val="22"/>
+                <w:szCs w:val="22"/>
+              </w:rPr>
+              <w:t>Javier A. Sevilla, Faya Wang, Rob Lion, Jim Sebek, Andi Schoppa</w:t>
+            </w:r>
+          </w:p>
+        </w:tc>
+      </w:tr>
+    </w:tbl>
+    <w:p>
+      <w:pPr>
+        <w:pStyle w:val="Heading1"/>
+        <w:pBdr>
+          <w:bottom w:val="single" w:sz="4" w:space="1" w:color="2E75B6"/>
+        </w:pBdr>
+        <w:rPr>
+          <w:sz w:val="22"/>
+          <w:szCs w:val="22"/>
+        </w:rPr>
+      </w:pPr>
+      <w:r>
+        <w:rPr>
+          <w:sz w:val="22"/>
+          <w:szCs w:val="22"/>
+        </w:rPr>
+        <w:t xml:space="preserve">1. Waveguide &amp; Circulator Layout </w:t>
+      </w:r>
+    </w:p>
+    <w:p>
+      <w:pPr>
+        <w:pStyle w:val="ListParagraph"/>
+        <w:numPr>
+          <w:ilvl w:val="0"/>
+          <w:numId w:val="29"/>
+        </w:numPr>
+        <w:spacing w:before="30" w:after="30" w:line="240" w:lineRule="auto"/>
+        <w:contextualSpacing w:val="0"/>
+        <w:rPr>
+          <w:sz w:val="22"/>
+          <w:szCs w:val="22"/>
+        </w:rPr>
+      </w:pPr>
+      <w:r>
+        <w:rPr>
+          <w:sz w:val="22"/>
+          <w:szCs w:val="22"/>
+        </w:rPr>
+        <w:t xml:space="preserve">Layout is feasible. Circulators are staggered: lower-level rotates clockwise, upper-level counterclockwise, allowing loads to nest compactly. Waveguides </w:t>
+      </w:r>
+      <w:proofErr w:type="gramStart"/>
+      <w:r>
+        <w:rPr>
+          <w:sz w:val="22"/>
+          <w:szCs w:val="22"/>
+        </w:rPr>
+        <w:t>exiting</w:t>
+      </w:r>
+      <w:proofErr w:type="gramEnd"/>
+      <w:r>
+        <w:rPr>
+          <w:sz w:val="22"/>
+          <w:szCs w:val="22"/>
+        </w:rPr>
+        <w:t xml:space="preserve"> the combiners are offset left/right to avoid crossing.</w:t>
+      </w:r>
+    </w:p>
+    <w:p>
+      <w:pPr>
+        <w:pStyle w:val="ListParagraph"/>
+        <w:numPr>
+          <w:ilvl w:val="0"/>
+          <w:numId w:val="29"/>
+        </w:numPr>
+        <w:spacing w:before="30" w:after="30" w:line="240" w:lineRule="auto"/>
+        <w:contextualSpacing w:val="0"/>
+        <w:rPr>
+          <w:sz w:val="22"/>
+          <w:szCs w:val="22"/>
+        </w:rPr>
+      </w:pPr>
+      <w:r>
+        <w:rPr>
+          <w:sz w:val="22"/>
+          <w:szCs w:val="22"/>
+        </w:rPr>
+        <w:t>Opportunity to simplify: a 30° sweep and two bends could be combined into a single custom piece.</w:t>
+      </w:r>
+    </w:p>
+    <w:p>
+      <w:pPr>
+        <w:pStyle w:val="ListParagraph"/>
+        <w:numPr>
+          <w:ilvl w:val="0"/>
+          <w:numId w:val="29"/>
+        </w:numPr>
+        <w:spacing w:before="30" w:after="30" w:line="240" w:lineRule="auto"/>
+        <w:contextualSpacing w:val="0"/>
+        <w:rPr>
+          <w:sz w:val="22"/>
+          <w:szCs w:val="22"/>
+        </w:rPr>
+      </w:pPr>
+      <w:r>
+        <w:rPr>
+          <w:sz w:val="22"/>
+          <w:szCs w:val="22"/>
+        </w:rPr>
+        <w:t>Circulator and load support: structural frames will be built below both the lower and upper platform levels. Loads are large but light enough for Unistrut support. Drain port orientation constrains load placement.</w:t>
+      </w:r>
+    </w:p>
+    <w:p>
+      <w:pPr>
+        <w:pStyle w:val="ListParagraph"/>
+        <w:numPr>
+          <w:ilvl w:val="0"/>
+          <w:numId w:val="29"/>
+        </w:numPr>
+        <w:spacing w:before="30" w:after="30" w:line="240" w:lineRule="auto"/>
+        <w:contextualSpacing w:val="0"/>
+        <w:rPr>
+          <w:sz w:val="22"/>
+          <w:szCs w:val="22"/>
+        </w:rPr>
+      </w:pPr>
+      <w:r>
+        <w:rPr>
+          <w:sz w:val="22"/>
+          <w:szCs w:val="22"/>
+        </w:rPr>
+        <w:t xml:space="preserve">Existing Klystron waveguide must be decommissioned during installation. </w:t>
+      </w:r>
+    </w:p>
+    <w:p>
+      <w:pPr>
+        <w:pStyle w:val="ListParagraph"/>
+        <w:numPr>
+          <w:ilvl w:val="0"/>
+          <w:numId w:val="29"/>
+        </w:numPr>
+        <w:spacing w:before="30" w:after="30" w:line="240" w:lineRule="auto"/>
+        <w:contextualSpacing w:val="0"/>
+        <w:rPr>
+          <w:sz w:val="22"/>
+          <w:szCs w:val="22"/>
+        </w:rPr>
+      </w:pPr>
+      <w:r>
+        <w:rPr>
+          <w:sz w:val="22"/>
+          <w:szCs w:val="22"/>
+        </w:rPr>
+        <w:t>Cable trays on the top of roof for waveguide access to cavities need to be repositioned.</w:t>
+      </w:r>
+    </w:p>
+    <w:p>
+      <w:pPr>
+        <w:pStyle w:val="Heading1"/>
+        <w:pBdr>
+          <w:bottom w:val="single" w:sz="4" w:space="1" w:color="2E75B6"/>
+        </w:pBdr>
+        <w:rPr>
+          <w:sz w:val="22"/>
+          <w:szCs w:val="22"/>
+        </w:rPr>
+      </w:pPr>
+      <w:r>
+        <w:rPr>
+          <w:sz w:val="22"/>
+          <w:szCs w:val="22"/>
+        </w:rPr>
+        <w:t>2. SSA Cabinet Power Distribution</w:t>
+      </w:r>
+    </w:p>
+    <w:p>
+      <w:pPr>
+        <w:pStyle w:val="ListParagraph"/>
+        <w:numPr>
+          <w:ilvl w:val="0"/>
+          <w:numId w:val="29"/>
+        </w:numPr>
+        <w:spacing w:before="30" w:after="30" w:line="240" w:lineRule="auto"/>
+        <w:contextualSpacing w:val="0"/>
+        <w:rPr>
+          <w:sz w:val="22"/>
+          <w:szCs w:val="22"/>
+        </w:rPr>
+      </w:pPr>
+      <w:r>
+        <w:rPr>
+          <w:sz w:val="22"/>
+          <w:szCs w:val="22"/>
+        </w:rPr>
+        <w:t>Each cabinet: 65 kW output, single 480V three-phase input at top, built-in breaker/disconnect, cooling water inlet/outlet at bottom (may need to be changed to top for the installed configuration — confirm with vendor).</w:t>
+      </w:r>
+    </w:p>
+    <w:p>
+      <w:pPr>
+        <w:pStyle w:val="ListParagraph"/>
+        <w:numPr>
+          <w:ilvl w:val="0"/>
+          <w:numId w:val="29"/>
+        </w:numPr>
+        <w:spacing w:before="30" w:after="30" w:line="240" w:lineRule="auto"/>
+        <w:contextualSpacing w:val="0"/>
+        <w:rPr>
+          <w:sz w:val="22"/>
+          <w:szCs w:val="22"/>
+        </w:rPr>
+      </w:pPr>
+      <w:r>
+        <w:rPr>
+          <w:sz w:val="22"/>
+          <w:szCs w:val="22"/>
+        </w:rPr>
+        <w:t xml:space="preserve">Each SSA station = 4 cabinets (2 rows of </w:t>
+      </w:r>
+      <w:r>
+        <w:rPr>
+          <w:sz w:val="22"/>
+          <w:szCs w:val="22"/>
+        </w:rPr>
+        <w:t>2</w:t>
+      </w:r>
+      <w:r>
+        <w:rPr>
+          <w:sz w:val="22"/>
+          <w:szCs w:val="22"/>
+        </w:rPr>
+        <w:t>). ~500 kW AC input per station. Infrastructure scope: deliver 480V three-phase (with neutral and ground) to each cabinet.</w:t>
+      </w:r>
+    </w:p>
+    <w:p>
+      <w:pPr>
+        <w:pStyle w:val="ListParagraph"/>
+        <w:numPr>
+          <w:ilvl w:val="0"/>
+          <w:numId w:val="29"/>
+        </w:numPr>
+        <w:spacing w:before="30" w:after="30" w:line="240" w:lineRule="auto"/>
+        <w:contextualSpacing w:val="0"/>
+        <w:rPr>
+          <w:sz w:val="22"/>
+          <w:szCs w:val="22"/>
+        </w:rPr>
+      </w:pPr>
+      <w:r>
+        <w:rPr>
+          <w:sz w:val="22"/>
+          <w:szCs w:val="22"/>
+        </w:rPr>
+        <w:t>~</w:t>
+      </w:r>
+      <w:r>
+        <w:rPr>
+          <w:sz w:val="22"/>
+          <w:szCs w:val="22"/>
+        </w:rPr>
+        <w:t>4</w:t>
+      </w:r>
+      <w:r>
+        <w:rPr>
+          <w:sz w:val="22"/>
+          <w:szCs w:val="22"/>
+        </w:rPr>
+        <w:t xml:space="preserve"> independent 480V conduit feeds per SSA station</w:t>
+      </w:r>
+      <w:r>
+        <w:rPr>
+          <w:sz w:val="22"/>
+          <w:szCs w:val="22"/>
+        </w:rPr>
+        <w:t>.</w:t>
+      </w:r>
+    </w:p>
+    <w:p>
+      <w:pPr>
+        <w:pStyle w:val="ListParagraph"/>
+        <w:numPr>
+          <w:ilvl w:val="0"/>
+          <w:numId w:val="29"/>
+        </w:numPr>
+        <w:spacing w:before="30" w:after="30" w:line="240" w:lineRule="auto"/>
+        <w:contextualSpacing w:val="0"/>
+        <w:rPr>
+          <w:sz w:val="22"/>
+          <w:szCs w:val="22"/>
+        </w:rPr>
+      </w:pPr>
+      <w:r>
+        <w:rPr>
+          <w:sz w:val="22"/>
+          <w:szCs w:val="22"/>
+        </w:rPr>
+        <w:t xml:space="preserve">Two power distribution panels as placeholders in the floor plan — one per level — located on </w:t>
+      </w:r>
+      <w:r>
+        <w:rPr>
+          <w:sz w:val="22"/>
+          <w:szCs w:val="22"/>
+        </w:rPr>
+        <w:t>near the BPM room</w:t>
+      </w:r>
+      <w:r>
+        <w:rPr>
+          <w:sz w:val="22"/>
+          <w:szCs w:val="22"/>
+        </w:rPr>
+        <w:t>.</w:t>
+      </w:r>
+    </w:p>
+    <w:p>
+      <w:pPr>
+        <w:pStyle w:val="Heading1"/>
+        <w:pBdr>
+          <w:bottom w:val="single" w:sz="4" w:space="1" w:color="2E75B6"/>
+        </w:pBdr>
+        <w:rPr>
+          <w:sz w:val="22"/>
+          <w:szCs w:val="22"/>
+        </w:rPr>
+      </w:pPr>
+      <w:r>
+        <w:rPr>
+          <w:sz w:val="22"/>
+          <w:szCs w:val="22"/>
+        </w:rPr>
+        <w:t>3. Cooling Water Infrastructure</w:t>
+      </w:r>
+    </w:p>
+    <w:p>
+      <w:pPr>
+        <w:pStyle w:val="ListParagraph"/>
+        <w:numPr>
+          <w:ilvl w:val="0"/>
+          <w:numId w:val="29"/>
+        </w:numPr>
+        <w:spacing w:before="30" w:after="30" w:line="240" w:lineRule="auto"/>
+        <w:contextualSpacing w:val="0"/>
+        <w:rPr>
+          <w:sz w:val="22"/>
+          <w:szCs w:val="22"/>
+        </w:rPr>
+      </w:pPr>
+      <w:r>
+        <w:rPr>
+          <w:sz w:val="22"/>
+          <w:szCs w:val="22"/>
+        </w:rPr>
+        <w:t>LCW manifold: one main supply/return run per level (overhead or along tunnel wall) with branches to each cabinet. Circulator cooling taps from the same supply.</w:t>
+      </w:r>
+    </w:p>
+    <w:p>
+      <w:pPr>
+        <w:pStyle w:val="ListParagraph"/>
+        <w:numPr>
+          <w:ilvl w:val="0"/>
+          <w:numId w:val="29"/>
+        </w:numPr>
+        <w:spacing w:before="30" w:after="30" w:line="240" w:lineRule="auto"/>
+        <w:contextualSpacing w:val="0"/>
+        <w:rPr>
+          <w:sz w:val="22"/>
+          <w:szCs w:val="22"/>
+        </w:rPr>
+      </w:pPr>
+      <w:r>
+        <w:rPr>
+          <w:sz w:val="22"/>
+          <w:szCs w:val="22"/>
+        </w:rPr>
+        <w:t>Cooling tower situation: the existing SSRL cooling tower (</w:t>
+      </w:r>
+      <w:r>
+        <w:rPr>
+          <w:sz w:val="22"/>
+          <w:szCs w:val="22"/>
+        </w:rPr>
+        <w:t>CT404</w:t>
+      </w:r>
+      <w:r>
+        <w:rPr>
+          <w:sz w:val="22"/>
+          <w:szCs w:val="22"/>
+        </w:rPr>
+        <w:t xml:space="preserve">) </w:t>
+      </w:r>
+      <w:r>
+        <w:rPr>
+          <w:sz w:val="22"/>
+          <w:szCs w:val="22"/>
+        </w:rPr>
+        <w:t xml:space="preserve">condition assessment </w:t>
+      </w:r>
+      <w:r>
+        <w:rPr>
+          <w:sz w:val="22"/>
+          <w:szCs w:val="22"/>
+        </w:rPr>
+        <w:t xml:space="preserve">recommends tear-down and full replacement. Ongoing dispute — Facilities </w:t>
+      </w:r>
+      <w:proofErr w:type="gramStart"/>
+      <w:r>
+        <w:rPr>
+          <w:sz w:val="22"/>
+          <w:szCs w:val="22"/>
+        </w:rPr>
+        <w:t>says</w:t>
+      </w:r>
+      <w:proofErr w:type="gramEnd"/>
+      <w:r>
+        <w:rPr>
+          <w:sz w:val="22"/>
+          <w:szCs w:val="22"/>
+        </w:rPr>
+        <w:t xml:space="preserve"> SSRL should fund replacement since it serves only one program; SSRL disagrees.</w:t>
+      </w:r>
+    </w:p>
+    <w:p>
+      <w:pPr>
+        <w:pStyle w:val="ListParagraph"/>
+        <w:numPr>
+          <w:ilvl w:val="0"/>
+          <w:numId w:val="29"/>
+        </w:numPr>
+        <w:spacing w:before="30" w:after="30" w:line="240" w:lineRule="auto"/>
+        <w:contextualSpacing w:val="0"/>
+        <w:rPr>
+          <w:sz w:val="22"/>
+          <w:szCs w:val="22"/>
+        </w:rPr>
+      </w:pPr>
+      <w:r>
+        <w:rPr>
+          <w:sz w:val="22"/>
+          <w:szCs w:val="22"/>
+        </w:rPr>
+        <w:t xml:space="preserve">Javier’s finding: the tower has 3 cells (~7,500 GPM total). </w:t>
+      </w:r>
+      <w:r>
+        <w:rPr>
+          <w:sz w:val="22"/>
+          <w:szCs w:val="22"/>
+        </w:rPr>
+        <w:t>The design</w:t>
+      </w:r>
+      <w:r>
+        <w:rPr>
+          <w:sz w:val="22"/>
+          <w:szCs w:val="22"/>
+        </w:rPr>
+        <w:t xml:space="preserve"> is reportedly sized for a 4th cell (~2,500 GPM). The SSA project needs only </w:t>
+      </w:r>
+      <w:r>
+        <w:rPr>
+          <w:sz w:val="22"/>
+          <w:szCs w:val="22"/>
+        </w:rPr>
+        <w:t>400</w:t>
+      </w:r>
+      <w:r>
+        <w:rPr>
+          <w:sz w:val="22"/>
+          <w:szCs w:val="22"/>
+        </w:rPr>
+        <w:t>~</w:t>
+      </w:r>
+      <w:r>
+        <w:rPr>
+          <w:sz w:val="22"/>
+          <w:szCs w:val="22"/>
+        </w:rPr>
+        <w:t>500</w:t>
+      </w:r>
+      <w:r>
+        <w:rPr>
+          <w:sz w:val="22"/>
+          <w:szCs w:val="22"/>
+        </w:rPr>
+        <w:t xml:space="preserve"> GPM, so tapping the tower via an additional partial cell is likely a low-cost option.</w:t>
+      </w:r>
+    </w:p>
+    <w:p>
+      <w:pPr>
+        <w:pStyle w:val="ListParagraph"/>
+        <w:numPr>
+          <w:ilvl w:val="0"/>
+          <w:numId w:val="29"/>
+        </w:numPr>
+        <w:spacing w:before="80" w:after="30" w:line="240" w:lineRule="auto"/>
+        <w:contextualSpacing w:val="0"/>
+        <w:rPr>
+          <w:sz w:val="22"/>
+          <w:szCs w:val="22"/>
+        </w:rPr>
+      </w:pPr>
+      <w:r>
+        <w:rPr>
+          <w:sz w:val="22"/>
+          <w:szCs w:val="22"/>
+        </w:rPr>
+        <w:t>Cost allocation: replacement of the existing tower = Facilities’ responsibility. Any new cell added specifically for the SSA project would be on the SSA budget.</w:t>
+      </w:r>
+    </w:p>
+    <w:p>
+      <w:pPr>
+        <w:pStyle w:val="Heading1"/>
+        <w:pBdr>
+          <w:bottom w:val="single" w:sz="4" w:space="1" w:color="2E75B6"/>
+        </w:pBdr>
+        <w:rPr>
+          <w:sz w:val="22"/>
+          <w:szCs w:val="22"/>
+        </w:rPr>
+      </w:pPr>
+      <w:r>
+        <w:rPr>
+          <w:sz w:val="22"/>
+          <w:szCs w:val="22"/>
+        </w:rPr>
+        <w:lastRenderedPageBreak/>
+        <w:t>4. Cost Estimating Approach</w:t>
+      </w:r>
+    </w:p>
+    <w:p>
+      <w:pPr>
+        <w:pStyle w:val="ListParagraph"/>
+        <w:numPr>
+          <w:ilvl w:val="0"/>
+          <w:numId w:val="29"/>
+        </w:numPr>
+        <w:spacing w:before="30" w:after="30" w:line="240" w:lineRule="auto"/>
+        <w:contextualSpacing w:val="0"/>
+        <w:rPr>
+          <w:sz w:val="22"/>
+          <w:szCs w:val="22"/>
+        </w:rPr>
+      </w:pPr>
+      <w:r>
+        <w:rPr>
+          <w:sz w:val="22"/>
+          <w:szCs w:val="22"/>
+        </w:rPr>
+        <w:t>Current estimate class: approaching Class 4 (</w:t>
+      </w:r>
+      <w:r>
+        <w:rPr>
+          <w:sz w:val="22"/>
+          <w:szCs w:val="22"/>
+        </w:rPr>
+        <w:t>5</w:t>
+      </w:r>
+      <w:r>
+        <w:rPr>
+          <w:sz w:val="22"/>
+          <w:szCs w:val="22"/>
+        </w:rPr>
+        <w:t>–15% design completion). Class 4 estimate with ~30%+ contingency is required for DOE BES.</w:t>
+      </w:r>
+    </w:p>
+    <w:p>
+      <w:pPr>
+        <w:pStyle w:val="ListParagraph"/>
+        <w:numPr>
+          <w:ilvl w:val="0"/>
+          <w:numId w:val="29"/>
+        </w:numPr>
+        <w:spacing w:before="80" w:after="30" w:line="240" w:lineRule="auto"/>
+        <w:contextualSpacing w:val="0"/>
+        <w:rPr>
+          <w:sz w:val="22"/>
+          <w:szCs w:val="22"/>
+        </w:rPr>
+      </w:pPr>
+      <w:r>
+        <w:rPr>
+          <w:sz w:val="22"/>
+          <w:szCs w:val="22"/>
+        </w:rPr>
+        <w:t xml:space="preserve">Target: cost estimate target by end of April 2026. We </w:t>
+      </w:r>
+      <w:r>
+        <w:rPr>
+          <w:sz w:val="22"/>
+          <w:szCs w:val="22"/>
+        </w:rPr>
+        <w:t xml:space="preserve">then </w:t>
+      </w:r>
+      <w:r>
+        <w:rPr>
+          <w:sz w:val="22"/>
+          <w:szCs w:val="22"/>
+        </w:rPr>
+        <w:t xml:space="preserve">can prepare summary slides for an internal SSRL review. Formal proposal/report can follow in May-June. </w:t>
+      </w:r>
+    </w:p>
+    <w:p>
+      <w:pPr>
+        <w:pStyle w:val="Heading1"/>
+        <w:pBdr>
+          <w:bottom w:val="single" w:sz="4" w:space="1" w:color="2E75B6"/>
+        </w:pBdr>
+        <w:rPr>
+          <w:sz w:val="22"/>
+          <w:szCs w:val="22"/>
+        </w:rPr>
+      </w:pPr>
+      <w:r>
+        <w:rPr>
+          <w:sz w:val="22"/>
+          <w:szCs w:val="22"/>
+        </w:rPr>
+        <w:t>5.</w:t>
+      </w:r>
+      <w:r>
+        <w:rPr>
+          <w:sz w:val="22"/>
+          <w:szCs w:val="22"/>
+        </w:rPr>
+        <w:t xml:space="preserve"> Action item</w:t>
+      </w:r>
+    </w:p>
+    <w:p>
+      <w:pPr>
+        <w:pStyle w:val="ListParagraph"/>
+        <w:numPr>
+          <w:ilvl w:val="0"/>
+          <w:numId w:val="29"/>
+        </w:numPr>
+        <w:spacing w:before="30" w:after="30" w:line="240" w:lineRule="auto"/>
+        <w:contextualSpacing w:val="0"/>
+        <w:rPr>
+          <w:sz w:val="22"/>
+          <w:szCs w:val="22"/>
+        </w:rPr>
+      </w:pPr>
+      <w:r>
+        <w:rPr>
+          <w:sz w:val="22"/>
+          <w:szCs w:val="22"/>
+        </w:rPr>
+        <w:t>Faya:</w:t>
+      </w:r>
+    </w:p>
+    <w:p>
+      <w:pPr>
+        <w:pStyle w:val="ListParagraph"/>
+        <w:spacing w:before="30" w:after="30"/>
+        <w:ind w:left="540"/>
+        <w:rPr>
+          <w:sz w:val="22"/>
+          <w:szCs w:val="22"/>
+        </w:rPr>
+      </w:pPr>
+      <w:r>
+        <w:rPr>
+          <w:sz w:val="22"/>
+          <w:szCs w:val="22"/>
+        </w:rPr>
+        <w:t>Prepare and distribute const breakdown excel sheet</w:t>
+      </w:r>
+    </w:p>
+    <w:p>
+      <w:pPr>
+        <w:pStyle w:val="ListParagraph"/>
+        <w:spacing w:before="30" w:after="30"/>
+        <w:ind w:left="540"/>
+        <w:rPr>
+          <w:sz w:val="22"/>
+          <w:szCs w:val="22"/>
+        </w:rPr>
+      </w:pPr>
+      <w:r>
+        <w:rPr>
+          <w:sz w:val="22"/>
+          <w:szCs w:val="22"/>
+        </w:rPr>
+        <w:t>Contact PMO (Shane’s group) to check availability and cost support for LCW, electricity, and infrastructure</w:t>
+      </w:r>
+    </w:p>
+    <w:p>
+      <w:pPr>
+        <w:pStyle w:val="ListParagraph"/>
+        <w:numPr>
+          <w:ilvl w:val="0"/>
+          <w:numId w:val="29"/>
+        </w:numPr>
+        <w:spacing w:before="30" w:after="30" w:line="240" w:lineRule="auto"/>
+        <w:contextualSpacing w:val="0"/>
+        <w:rPr>
+          <w:sz w:val="22"/>
+          <w:szCs w:val="22"/>
+        </w:rPr>
+      </w:pPr>
+      <w:r>
+        <w:rPr>
+          <w:sz w:val="22"/>
+          <w:szCs w:val="22"/>
+        </w:rPr>
+        <w:t>Javier:</w:t>
+      </w:r>
+    </w:p>
+    <w:p>
+      <w:pPr>
+        <w:pStyle w:val="ListParagraph"/>
+        <w:spacing w:before="30" w:after="30"/>
+        <w:ind w:left="540"/>
+        <w:rPr>
+          <w:sz w:val="22"/>
+          <w:szCs w:val="22"/>
+        </w:rPr>
+      </w:pPr>
+      <w:r>
+        <w:rPr>
+          <w:sz w:val="22"/>
+          <w:szCs w:val="22"/>
+        </w:rPr>
+        <w:t>Obtain writer condition assessment report on existing cooling tower and Facilities cost allocation</w:t>
+      </w:r>
+    </w:p>
+    <w:p>
+      <w:pPr>
+        <w:pStyle w:val="ListParagraph"/>
+        <w:spacing w:before="30" w:after="30"/>
+        <w:ind w:left="540"/>
+        <w:rPr>
+          <w:sz w:val="22"/>
+          <w:szCs w:val="22"/>
+        </w:rPr>
+      </w:pPr>
+      <w:r>
+        <w:rPr>
+          <w:sz w:val="22"/>
+          <w:szCs w:val="22"/>
+        </w:rPr>
+        <w:t>Collect information about cable tray</w:t>
+      </w:r>
+    </w:p>
+    <w:p>
+      <w:pPr>
+        <w:pStyle w:val="ListParagraph"/>
+        <w:spacing w:before="30" w:after="30"/>
+        <w:ind w:left="540"/>
+        <w:rPr>
+          <w:sz w:val="22"/>
+          <w:szCs w:val="22"/>
+        </w:rPr>
+      </w:pPr>
+      <w:r>
+        <w:rPr>
+          <w:sz w:val="22"/>
+          <w:szCs w:val="22"/>
+        </w:rPr>
+        <w:t>Working with Jim on power feeds for SSA</w:t>
+      </w:r>
+    </w:p>
+    <w:p>
+      <w:pPr>
+        <w:pStyle w:val="ListParagraph"/>
+        <w:numPr>
+          <w:ilvl w:val="0"/>
+          <w:numId w:val="30"/>
+        </w:numPr>
+        <w:spacing w:before="30" w:after="30" w:line="240" w:lineRule="auto"/>
+        <w:contextualSpacing w:val="0"/>
+        <w:rPr>
+          <w:sz w:val="22"/>
+          <w:szCs w:val="22"/>
+        </w:rPr>
+      </w:pPr>
+      <w:r>
+        <w:rPr>
+          <w:sz w:val="22"/>
+          <w:szCs w:val="22"/>
+        </w:rPr>
+        <w:t>ALL: fill in technical cost categories in the excel sheet.</w:t>
+      </w:r>
+    </w:p>
+    <w:p/>
+    <w:p>
+      <w:pPr>
+        <w:pStyle w:val="Heading2"/>
+        <w:rPr>
+          <w:sz w:val="22"/>
+          <w:szCs w:val="22"/>
+        </w:rPr>
+      </w:pPr>
+      <w:r>
+        <w:rPr>
+          <w:sz w:val="22"/>
+          <w:szCs w:val="22"/>
+        </w:rPr>
+        <w:t>MEETING NOTES</w:t>
+      </w:r>
+    </w:p>
+    <w:p>
+      <w:pPr>
+        <w:rPr>
+          <w:sz w:val="22"/>
+          <w:szCs w:val="22"/>
+        </w:rPr>
+      </w:pPr>
+      <w:r>
+        <w:rPr>
+          <w:sz w:val="22"/>
+          <w:szCs w:val="22"/>
+        </w:rPr>
+        <w:t>March 10, 2026</w:t>
+      </w:r>
+    </w:p>
+    <w:p>
+      <w:pPr>
+        <w:rPr>
+          <w:sz w:val="22"/>
+          <w:szCs w:val="22"/>
+        </w:rPr>
+      </w:pPr>
+      <w:r>
+        <w:rPr>
+          <w:sz w:val="22"/>
+          <w:szCs w:val="22"/>
+        </w:rPr>
+        <w:t>Attendees: Javier, Jim, Andi, Rob, Faya</w:t>
+      </w:r>
+      <w:r>
+        <w:rPr>
+          <w:sz w:val="22"/>
+          <w:szCs w:val="22"/>
+        </w:rPr>
+        <w:t>, Xiaobiao, Kira</w:t>
+      </w:r>
+    </w:p>
+    <w:p>
+      <w:pPr>
         <w:rPr>
           <w:b/>
           <w:bCs/>
           <w:sz w:val="22"/>
           <w:szCs w:val="22"/>
         </w:rPr>
-        <w:t>1. LCW / HCW Cooling System Review</w:t>
-      </w:r>
-    </w:p>
-    <w:p>
-      <w:pPr>
+      </w:pPr>
+      <w:r>
         <w:rPr>
           <w:b/>
           <w:bCs/>
           <w:sz w:val="22"/>
           <w:szCs w:val="22"/>
         </w:rPr>
-      </w:pPr>
-      <w:r>
+        <w:t>1. LCW / HCW Cooling System Review</w:t>
+      </w:r>
+    </w:p>
+    <w:p>
+      <w:pPr>
         <w:rPr>
           <w:b/>
           <w:bCs/>
           <w:sz w:val="22"/>
           <w:szCs w:val="22"/>
         </w:rPr>
-        <w:t>1.1 Existing System Background</w:t>
-      </w:r>
-    </w:p>
-    <w:p>
-      <w:pPr>
-        <w:rPr>
-          <w:sz w:val="22"/>
-          <w:szCs w:val="22"/>
-        </w:rPr>
-      </w:pPr>
-      <w:r>
-        <w:rPr>
-          <w:sz w:val="22"/>
-          <w:szCs w:val="22"/>
-        </w:rPr>
-        <w:t>Rob found Spear Engineering Note M535, which documents the original LCW system design.</w:t>
-      </w:r>
-    </w:p>
-    <w:p>
-      <w:pPr>
-        <w:rPr>
-          <w:sz w:val="22"/>
-          <w:szCs w:val="22"/>
-        </w:rPr>
-      </w:pPr>
-      <w:r>
-        <w:rPr>
-          <w:sz w:val="22"/>
-          <w:szCs w:val="22"/>
-        </w:rPr>
-        <w:t>The system piping was originally designed for 600 GPM (max</w:t>
-      </w:r>
-      <w:proofErr w:type="gramStart"/>
-      <w:r>
-        <w:rPr>
-          <w:sz w:val="22"/>
-          <w:szCs w:val="22"/>
-        </w:rPr>
-        <w:t>), but</w:t>
-      </w:r>
-      <w:proofErr w:type="gramEnd"/>
-      <w:r>
-        <w:rPr>
-          <w:sz w:val="22"/>
-          <w:szCs w:val="22"/>
-        </w:rPr>
-        <w:t xml:space="preserve"> has been operated at only 300 GPM.</w:t>
-      </w:r>
-    </w:p>
-    <w:p>
-      <w:pPr>
-        <w:rPr>
-          <w:sz w:val="22"/>
-          <w:szCs w:val="22"/>
-        </w:rPr>
-      </w:pPr>
-      <w:r>
-        <w:rPr>
-          <w:sz w:val="22"/>
-          <w:szCs w:val="22"/>
-        </w:rPr>
-        <w:t>The HCW (High Conductivity Water) system was installed specifically for the SPEAR/PEP2 RF system, as a local system that may not appear on facility master LCW drawings.</w:t>
-      </w:r>
-    </w:p>
-    <w:p>
-      <w:pPr>
-        <w:rPr>
-          <w:sz w:val="22"/>
-          <w:szCs w:val="22"/>
-        </w:rPr>
-      </w:pPr>
-      <w:r>
-        <w:rPr>
-          <w:sz w:val="22"/>
-          <w:szCs w:val="22"/>
-        </w:rPr>
-        <w:t>The existing HCW system for the magic loads (RF power dumps) is separate from the LCW system that cools the Klystron.</w:t>
-      </w:r>
-    </w:p>
-    <w:p>
-      <w:pPr>
-        <w:rPr>
-          <w:sz w:val="22"/>
-          <w:szCs w:val="22"/>
-        </w:rPr>
-      </w:pPr>
-      <w:r>
-        <w:rPr>
-          <w:sz w:val="22"/>
-          <w:szCs w:val="22"/>
-        </w:rPr>
-        <w:t>All Klystron cooling (collector, circulator, body circuits) uses LCW, not HCW.</w:t>
-      </w:r>
-    </w:p>
-    <w:p>
-      <w:pPr>
-        <w:rPr>
-          <w:sz w:val="22"/>
-          <w:szCs w:val="22"/>
-        </w:rPr>
-      </w:pPr>
-      <w:r>
-        <w:rPr>
-          <w:sz w:val="22"/>
-          <w:szCs w:val="22"/>
-        </w:rPr>
-        <w:t>Magic loads (RF power dumps on the tunnel roof) and circulator loads are cooled by HCW.</w:t>
-      </w:r>
-    </w:p>
-    <w:p>
-      <w:pPr>
+      </w:pPr>
+      <w:r>
         <w:rPr>
           <w:b/>
           <w:bCs/>
           <w:sz w:val="22"/>
           <w:szCs w:val="22"/>
         </w:rPr>
-      </w:pPr>
-      <w:r>
+        <w:t>1.1 Existing System Background</w:t>
+      </w:r>
+    </w:p>
+    <w:p>
+      <w:pPr>
+        <w:rPr>
+          <w:sz w:val="22"/>
+          <w:szCs w:val="22"/>
+        </w:rPr>
+      </w:pPr>
+      <w:r>
+        <w:rPr>
+          <w:sz w:val="22"/>
+          <w:szCs w:val="22"/>
+        </w:rPr>
+        <w:t>Rob found Spear Engineering Note M535, which documents the original LCW system design.</w:t>
+      </w:r>
+    </w:p>
+    <w:p>
+      <w:pPr>
+        <w:rPr>
+          <w:sz w:val="22"/>
+          <w:szCs w:val="22"/>
+        </w:rPr>
+      </w:pPr>
+      <w:r>
+        <w:rPr>
+          <w:sz w:val="22"/>
+          <w:szCs w:val="22"/>
+        </w:rPr>
+        <w:t>The system piping was originally designed for 600 GPM (max</w:t>
+      </w:r>
+      <w:proofErr w:type="gramStart"/>
+      <w:r>
+        <w:rPr>
+          <w:sz w:val="22"/>
+          <w:szCs w:val="22"/>
+        </w:rPr>
+        <w:t>), but</w:t>
+      </w:r>
+      <w:proofErr w:type="gramEnd"/>
+      <w:r>
+        <w:rPr>
+          <w:sz w:val="22"/>
+          <w:szCs w:val="22"/>
+        </w:rPr>
+        <w:t xml:space="preserve"> has been operated at only 300 GPM.</w:t>
+      </w:r>
+    </w:p>
+    <w:p>
+      <w:pPr>
+        <w:rPr>
+          <w:sz w:val="22"/>
+          <w:szCs w:val="22"/>
+        </w:rPr>
+      </w:pPr>
+      <w:r>
+        <w:rPr>
+          <w:sz w:val="22"/>
+          <w:szCs w:val="22"/>
+        </w:rPr>
+        <w:t>The HCW (High Conductivity Water) system was installed specifically for the SPEAR/PEP2 RF system, as a local system that may not appear on facility master LCW drawings.</w:t>
+      </w:r>
+    </w:p>
+    <w:p>
+      <w:pPr>
+        <w:rPr>
+          <w:sz w:val="22"/>
+          <w:szCs w:val="22"/>
+        </w:rPr>
+      </w:pPr>
+      <w:r>
+        <w:rPr>
+          <w:sz w:val="22"/>
+          <w:szCs w:val="22"/>
+        </w:rPr>
+        <w:t>The existing HCW system for the magic loads (RF power dumps) is separate from the LCW system that cools the Klystron.</w:t>
+      </w:r>
+    </w:p>
+    <w:p>
+      <w:pPr>
+        <w:rPr>
+          <w:sz w:val="22"/>
+          <w:szCs w:val="22"/>
+        </w:rPr>
+      </w:pPr>
+      <w:r>
+        <w:rPr>
+          <w:sz w:val="22"/>
+          <w:szCs w:val="22"/>
+        </w:rPr>
+        <w:t>All Klystron cooling (collector, circulator, body circuits) uses LCW, not HCW.</w:t>
+      </w:r>
+    </w:p>
+    <w:p>
+      <w:pPr>
+        <w:rPr>
+          <w:sz w:val="22"/>
+          <w:szCs w:val="22"/>
+        </w:rPr>
+      </w:pPr>
+      <w:r>
+        <w:rPr>
+          <w:sz w:val="22"/>
+          <w:szCs w:val="22"/>
+        </w:rPr>
+        <w:t>Magic loads (RF power dumps on the tunnel roof) and circulator loads are cooled by HCW.</w:t>
+      </w:r>
+    </w:p>
+    <w:p>
+      <w:pPr>
         <w:rPr>
           <w:b/>
           <w:bCs/>
           <w:sz w:val="22"/>
           <w:szCs w:val="22"/>
         </w:rPr>
-        <w:t>1.2 Current Klystron Cooling Flow Data</w:t>
-      </w:r>
-    </w:p>
-    <w:p>
-      <w:pPr>
-        <w:rPr>
-          <w:sz w:val="22"/>
-          <w:szCs w:val="22"/>
-        </w:rPr>
-      </w:pPr>
-      <w:r>
-        <w:rPr>
-          <w:sz w:val="22"/>
-          <w:szCs w:val="22"/>
-        </w:rPr>
-        <w:t>Klystron collector: approx. 150 GPM (per design document); actual flow may be 170-270 GPM -- needs verification with Eddie.</w:t>
-      </w:r>
-    </w:p>
-    <w:p>
-      <w:pPr>
-        <w:rPr>
-          <w:sz w:val="22"/>
-          <w:szCs w:val="22"/>
-        </w:rPr>
-      </w:pPr>
-      <w:r>
-        <w:rPr>
-          <w:sz w:val="22"/>
-          <w:szCs w:val="22"/>
-        </w:rPr>
-        <w:t>Klystron circulator: approx. 15 GPM.</w:t>
-      </w:r>
-    </w:p>
-    <w:p>
-      <w:pPr>
-        <w:rPr>
-          <w:sz w:val="22"/>
-          <w:szCs w:val="22"/>
-        </w:rPr>
-      </w:pPr>
-      <w:r>
-        <w:rPr>
-          <w:sz w:val="22"/>
-          <w:szCs w:val="22"/>
-        </w:rPr>
-        <w:t>Original Klystron heat load was specified at 1,300 kW; current operation is 800 kW nominal.</w:t>
-      </w:r>
-    </w:p>
-    <w:p>
-      <w:pPr>
-        <w:rPr>
-          <w:sz w:val="22"/>
-          <w:szCs w:val="22"/>
-        </w:rPr>
-      </w:pPr>
-      <w:r>
-        <w:rPr>
-          <w:sz w:val="22"/>
-          <w:szCs w:val="22"/>
-        </w:rPr>
-        <w:t>Current HCW MPS (Machine Protection System) limit: 75 degrees C; currently running at 25 degrees C.</w:t>
-      </w:r>
-    </w:p>
-    <w:p>
-      <w:pPr>
-        <w:rPr>
-          <w:sz w:val="22"/>
-          <w:szCs w:val="22"/>
-        </w:rPr>
-      </w:pPr>
-      <w:r>
-        <w:rPr>
-          <w:sz w:val="22"/>
-          <w:szCs w:val="22"/>
-        </w:rPr>
-        <w:t>Collector water delta T: 12 degrees C currently; MPS limit is 20 degrees.</w:t>
-      </w:r>
-    </w:p>
-    <w:p>
-      <w:pPr>
+      </w:pPr>
+      <w:r>
         <w:rPr>
           <w:b/>
           <w:bCs/>
           <w:sz w:val="22"/>
           <w:szCs w:val="22"/>
         </w:rPr>
-      </w:pPr>
-      <w:r>
+        <w:t>1.2 Current Klystron Cooling Flow Data</w:t>
+      </w:r>
+    </w:p>
+    <w:p>
+      <w:pPr>
+        <w:rPr>
+          <w:sz w:val="22"/>
+          <w:szCs w:val="22"/>
+        </w:rPr>
+      </w:pPr>
+      <w:r>
+        <w:rPr>
+          <w:sz w:val="22"/>
+          <w:szCs w:val="22"/>
+        </w:rPr>
+        <w:lastRenderedPageBreak/>
+        <w:t>Klystron collector: approx. 150 GPM (per design document); actual flow may be 170-270 GPM -- needs verification with Eddie.</w:t>
+      </w:r>
+    </w:p>
+    <w:p>
+      <w:pPr>
+        <w:rPr>
+          <w:sz w:val="22"/>
+          <w:szCs w:val="22"/>
+        </w:rPr>
+      </w:pPr>
+      <w:r>
+        <w:rPr>
+          <w:sz w:val="22"/>
+          <w:szCs w:val="22"/>
+        </w:rPr>
+        <w:t>Klystron circulator: approx. 15 GPM.</w:t>
+      </w:r>
+    </w:p>
+    <w:p>
+      <w:pPr>
+        <w:rPr>
+          <w:sz w:val="22"/>
+          <w:szCs w:val="22"/>
+        </w:rPr>
+      </w:pPr>
+      <w:r>
+        <w:rPr>
+          <w:sz w:val="22"/>
+          <w:szCs w:val="22"/>
+        </w:rPr>
+        <w:t>Original Klystron heat load was specified at 1,300 kW; current operation is 800 kW nominal.</w:t>
+      </w:r>
+    </w:p>
+    <w:p>
+      <w:pPr>
+        <w:rPr>
+          <w:sz w:val="22"/>
+          <w:szCs w:val="22"/>
+        </w:rPr>
+      </w:pPr>
+      <w:r>
+        <w:rPr>
+          <w:sz w:val="22"/>
+          <w:szCs w:val="22"/>
+        </w:rPr>
+        <w:t>Current HCW MPS (Machine Protection System) limit: 75 degrees C; currently running at 25 degrees C.</w:t>
+      </w:r>
+    </w:p>
+    <w:p>
+      <w:pPr>
+        <w:rPr>
+          <w:sz w:val="22"/>
+          <w:szCs w:val="22"/>
+        </w:rPr>
+      </w:pPr>
+      <w:r>
+        <w:rPr>
+          <w:sz w:val="22"/>
+          <w:szCs w:val="22"/>
+        </w:rPr>
+        <w:t>Collector water delta T: 12 degrees C currently; MPS limit is 20 degrees.</w:t>
+      </w:r>
+    </w:p>
+    <w:p>
+      <w:pPr>
         <w:rPr>
           <w:b/>
           <w:bCs/>
           <w:sz w:val="22"/>
           <w:szCs w:val="22"/>
         </w:rPr>
-        <w:t>1.3 update by Eddie 3/11/2026</w:t>
-      </w:r>
-    </w:p>
-    <w:p>
-      <w:pPr>
-        <w:rPr>
-          <w:sz w:val="22"/>
-          <w:szCs w:val="22"/>
-        </w:rPr>
-      </w:pPr>
-      <w:r>
-        <w:rPr>
-          <w:sz w:val="22"/>
-          <w:szCs w:val="22"/>
-        </w:rPr>
-        <w:t>SPEAR complex total LCW: 2,539 GPM (confirmed by Eddie). Breakdown: SPEAR ring 1,853 GPM / 2.4 MW, Injector Building 140 428 GPM / 160 kW, SSRL 258 GPM / 130 kW. Inlet temp 30.6 degrees C; SPEAR outlet 35.6 degrees C. Inlet pressure 255 psi, outlet pressure 31 psi. Combined thermal load ~2.69 MW.</w:t>
-      </w:r>
-    </w:p>
-    <w:p>
-      <w:pPr>
-        <w:rPr>
-          <w:sz w:val="22"/>
-          <w:szCs w:val="22"/>
-        </w:rPr>
-      </w:pPr>
-      <w:r>
-        <w:rPr>
-          <w:sz w:val="22"/>
-          <w:szCs w:val="22"/>
-        </w:rPr>
-        <w:t>Note: Engineering notes reviewed during the meeting are outdated -- the boost pump was removed ~2010 and a new SPEAR Klystron was installed ~2020, both of which changed operating parameters (per Eddie).</w:t>
-      </w:r>
-    </w:p>
-    <w:p>
-      <w:pPr>
-        <w:rPr>
-          <w:sz w:val="22"/>
-          <w:szCs w:val="22"/>
-        </w:rPr>
-      </w:pPr>
-      <w:r>
-        <w:rPr>
-          <w:sz w:val="22"/>
-          <w:szCs w:val="22"/>
-        </w:rPr>
-        <w:lastRenderedPageBreak/>
-        <w:t xml:space="preserve">SPEAR ring LCW delta T (confirmed by Eddie): inlet 30.6 degrees C, outlet 35.6 degrees C (delta T = 5 degrees C). Total complex thermal load ~2.69 MW at 2,539 GPM total flow. </w:t>
-      </w:r>
-    </w:p>
-    <w:p>
-      <w:pPr>
+      </w:pPr>
+      <w:r>
         <w:rPr>
           <w:b/>
           <w:bCs/>
           <w:sz w:val="22"/>
           <w:szCs w:val="22"/>
         </w:rPr>
-      </w:pPr>
-      <w:r>
+        <w:t>1.3 update by Eddie 3/11/2026</w:t>
+      </w:r>
+    </w:p>
+    <w:p>
+      <w:pPr>
+        <w:rPr>
+          <w:sz w:val="22"/>
+          <w:szCs w:val="22"/>
+        </w:rPr>
+      </w:pPr>
+      <w:r>
+        <w:rPr>
+          <w:sz w:val="22"/>
+          <w:szCs w:val="22"/>
+        </w:rPr>
+        <w:t>SPEAR complex total LCW: 2,539 GPM (confirmed by Eddie). Breakdown: SPEAR ring 1,853 GPM / 2.4 MW, Injector Building 140 428 GPM / 160 kW, SSRL 258 GPM / 130 kW. Inlet temp 30.6 degrees C; SPEAR outlet 35.6 degrees C. Inlet pressure 255 psi, outlet pressure 31 psi. Combined thermal load ~2.69 MW.</w:t>
+      </w:r>
+    </w:p>
+    <w:p>
+      <w:pPr>
+        <w:rPr>
+          <w:sz w:val="22"/>
+          <w:szCs w:val="22"/>
+        </w:rPr>
+      </w:pPr>
+      <w:r>
+        <w:rPr>
+          <w:sz w:val="22"/>
+          <w:szCs w:val="22"/>
+        </w:rPr>
+        <w:t>Note: Engineering notes reviewed during the meeting are outdated -- the boost pump was removed ~2010 and a new SPEAR Klystron was installed ~2020, both of which changed operating parameters (per Eddie).</w:t>
+      </w:r>
+    </w:p>
+    <w:p>
+      <w:pPr>
+        <w:rPr>
+          <w:sz w:val="22"/>
+          <w:szCs w:val="22"/>
+        </w:rPr>
+      </w:pPr>
+      <w:r>
+        <w:rPr>
+          <w:sz w:val="22"/>
+          <w:szCs w:val="22"/>
+        </w:rPr>
+        <w:t xml:space="preserve">SPEAR ring LCW delta T (confirmed by Eddie): inlet 30.6 degrees C, outlet 35.6 degrees C (delta T = 5 degrees C). Total complex thermal load ~2.69 MW at 2,539 GPM total flow. </w:t>
+      </w:r>
+    </w:p>
+    <w:p>
+      <w:pPr>
         <w:rPr>
           <w:b/>
           <w:bCs/>
           <w:sz w:val="22"/>
           <w:szCs w:val="22"/>
         </w:rPr>
+      </w:pPr>
+      <w:r>
+        <w:rPr>
+          <w:b/>
+          <w:bCs/>
+          <w:sz w:val="22"/>
+          <w:szCs w:val="22"/>
+        </w:rPr>
         <w:t>1.4 New SSA Cooling Requirements</w:t>
       </w:r>
     </w:p>
@@ -555,6 +1609,7 @@
           <w:szCs w:val="22"/>
           <w:highlight w:val="yellow"/>
         </w:rPr>
+        <w:lastRenderedPageBreak/>
         <w:t>Option C</w:t>
       </w:r>
       <w:r>
@@ -741,7 +1796,6 @@
           <w:sz w:val="22"/>
           <w:szCs w:val="22"/>
         </w:rPr>
-        <w:lastRenderedPageBreak/>
         <w:t>Clear height under the equipment platform structure: 9 feet for now.</w:t>
       </w:r>
     </w:p>
@@ -962,6 +2016,7 @@
           <w:sz w:val="22"/>
           <w:szCs w:val="22"/>
         </w:rPr>
+        <w:lastRenderedPageBreak/>
         <w:t>Benefit: Relocating the pipe would allow the new building footprint to be extended (longer), which could ease layout constraints.</w:t>
       </w:r>
     </w:p>
@@ -1121,7 +2176,6 @@
           <w:sz w:val="22"/>
           <w:szCs w:val="22"/>
         </w:rPr>
-        <w:lastRenderedPageBreak/>
         <w:t>3. RF Waveguide Routing &amp; SSA Layout</w:t>
       </w:r>
     </w:p>
@@ -1346,6 +2400,7 @@
           <w:sz w:val="22"/>
           <w:szCs w:val="22"/>
         </w:rPr>
+        <w:lastRenderedPageBreak/>
         <w:t>3.3 Waveguide Length Matching</w:t>
       </w:r>
     </w:p>
@@ -1513,7 +2568,6 @@
           <w:sz w:val="22"/>
           <w:szCs w:val="22"/>
         </w:rPr>
-        <w:lastRenderedPageBreak/>
         <w:t xml:space="preserve">9 feet </w:t>
       </w:r>
       <w:proofErr w:type="gramStart"/>
@@ -1787,6 +2841,7 @@
           <w:sz w:val="22"/>
           <w:szCs w:val="22"/>
         </w:rPr>
+        <w:lastRenderedPageBreak/>
         <w:t>Key Discussions:</w:t>
       </w:r>
     </w:p>
@@ -2022,7 +3077,6 @@
           <w:sz w:val="22"/>
           <w:szCs w:val="22"/>
         </w:rPr>
-        <w:lastRenderedPageBreak/>
         <w:t>Future MIE beamline extension will occupy current roadway area and require utility relocations outside the ring — both SSA and MIE are 5+ years out but must be coordinated.</w:t>
       </w:r>
     </w:p>
@@ -2396,6 +3450,7 @@
           <w:sz w:val="22"/>
           <w:szCs w:val="22"/>
         </w:rPr>
+        <w:lastRenderedPageBreak/>
         <w:t>Roof waveguide splitters removed; direct 1:1 SSA-to-cavity runs (4 independent).</w:t>
       </w:r>
     </w:p>
@@ -2624,7 +3679,6 @@
           <w:sz w:val="22"/>
           <w:szCs w:val="22"/>
         </w:rPr>
-        <w:lastRenderedPageBreak/>
         <w:t>Electrical setup and power supply:</w:t>
       </w:r>
     </w:p>
@@ -3085,6 +4139,7 @@
           <w:sz w:val="22"/>
           <w:szCs w:val="22"/>
         </w:rPr>
+        <w:lastRenderedPageBreak/>
         <w:t xml:space="preserve">Preference: </w:t>
       </w:r>
       <w:proofErr w:type="gramStart"/>
@@ -3425,7 +4480,6 @@
           <w:sz w:val="22"/>
           <w:szCs w:val="22"/>
         </w:rPr>
-        <w:lastRenderedPageBreak/>
         <w:t xml:space="preserve">Javier: site visit, </w:t>
       </w:r>
       <w:proofErr w:type="gramStart"/>
@@ -3844,6 +4898,7 @@
           <w:sz w:val="22"/>
           <w:szCs w:val="22"/>
         </w:rPr>
+        <w:lastRenderedPageBreak/>
         <w:t>Javier has contacted F&amp;O for additional details; Andi will coordinate as needed. Key items to confirm include available breaker capacity at Substation 507 and code compliance. Boris (F&amp;O) expressed general support, though timelines remain uncertain.</w:t>
       </w:r>
     </w:p>
@@ -4057,7 +5112,6 @@
           <w:sz w:val="22"/>
           <w:szCs w:val="22"/>
         </w:rPr>
-        <w:lastRenderedPageBreak/>
         <w:t>Providing crane access (a 2-ton crane was suggested)</w:t>
       </w:r>
     </w:p>
@@ -4283,6 +5337,7 @@
           <w:sz w:val="22"/>
           <w:szCs w:val="22"/>
         </w:rPr>
+        <w:lastRenderedPageBreak/>
         <w:t>Test stand hardware procurement could begin in the near term, but facility design and construction are expected to lag due to limited engineering resources, particularly Andi’s availability.</w:t>
       </w:r>
     </w:p>
@@ -4514,7 +5569,6 @@
           <w:sz w:val="22"/>
           <w:szCs w:val="22"/>
         </w:rPr>
-        <w:lastRenderedPageBreak/>
         <w:t>Action Items</w:t>
       </w:r>
     </w:p>
@@ -4776,6 +5830,7 @@
           <w:sz w:val="22"/>
           <w:szCs w:val="22"/>
         </w:rPr>
+        <w:lastRenderedPageBreak/>
         <w:t>Provide input on utilities and code requirements when available</w:t>
       </w:r>
     </w:p>
@@ -7885,6 +8940,119 @@
     </w:lvl>
   </w:abstractNum>
   <w:abstractNum w:abstractNumId="25" w15:restartNumberingAfterBreak="0">
+    <w:nsid w:val="6B7F263F"/>
+    <w:multiLevelType w:val="hybridMultilevel"/>
+    <w:tmpl w:val="EAEC22C8"/>
+    <w:lvl w:ilvl="0" w:tplc="04090001">
+      <w:start w:val="1"/>
+      <w:numFmt w:val="bullet"/>
+      <w:lvlText w:val=""/>
+      <w:lvlJc w:val="left"/>
+      <w:pPr>
+        <w:ind w:left="720" w:hanging="360"/>
+      </w:pPr>
+      <w:rPr>
+        <w:rFonts w:ascii="Symbol" w:hAnsi="Symbol" w:hint="default"/>
+      </w:rPr>
+    </w:lvl>
+    <w:lvl w:ilvl="1" w:tplc="04090003" w:tentative="1">
+      <w:start w:val="1"/>
+      <w:numFmt w:val="bullet"/>
+      <w:lvlText w:val="o"/>
+      <w:lvlJc w:val="left"/>
+      <w:pPr>
+        <w:ind w:left="1440" w:hanging="360"/>
+      </w:pPr>
+      <w:rPr>
+        <w:rFonts w:ascii="Courier New" w:hAnsi="Courier New" w:cs="Courier New" w:hint="default"/>
+      </w:rPr>
+    </w:lvl>
+    <w:lvl w:ilvl="2" w:tplc="04090005" w:tentative="1">
+      <w:start w:val="1"/>
+      <w:numFmt w:val="bullet"/>
+      <w:lvlText w:val=""/>
+      <w:lvlJc w:val="left"/>
+      <w:pPr>
+        <w:ind w:left="2160" w:hanging="360"/>
+      </w:pPr>
+      <w:rPr>
+        <w:rFonts w:ascii="Wingdings" w:hAnsi="Wingdings" w:hint="default"/>
+      </w:rPr>
+    </w:lvl>
+    <w:lvl w:ilvl="3" w:tplc="04090001" w:tentative="1">
+      <w:start w:val="1"/>
+      <w:numFmt w:val="bullet"/>
+      <w:lvlText w:val=""/>
+      <w:lvlJc w:val="left"/>
+      <w:pPr>
+        <w:ind w:left="2880" w:hanging="360"/>
+      </w:pPr>
+      <w:rPr>
+        <w:rFonts w:ascii="Symbol" w:hAnsi="Symbol" w:hint="default"/>
+      </w:rPr>
+    </w:lvl>
+    <w:lvl w:ilvl="4" w:tplc="04090003" w:tentative="1">
+      <w:start w:val="1"/>
+      <w:numFmt w:val="bullet"/>
+      <w:lvlText w:val="o"/>
+      <w:lvlJc w:val="left"/>
+      <w:pPr>
+        <w:ind w:left="3600" w:hanging="360"/>
+      </w:pPr>
+      <w:rPr>
+        <w:rFonts w:ascii="Courier New" w:hAnsi="Courier New" w:cs="Courier New" w:hint="default"/>
+      </w:rPr>
+    </w:lvl>
+    <w:lvl w:ilvl="5" w:tplc="04090005" w:tentative="1">
+      <w:start w:val="1"/>
+      <w:numFmt w:val="bullet"/>
+      <w:lvlText w:val=""/>
+      <w:lvlJc w:val="left"/>
+      <w:pPr>
+        <w:ind w:left="4320" w:hanging="360"/>
+      </w:pPr>
+      <w:rPr>
+        <w:rFonts w:ascii="Wingdings" w:hAnsi="Wingdings" w:hint="default"/>
+      </w:rPr>
+    </w:lvl>
+    <w:lvl w:ilvl="6" w:tplc="04090001" w:tentative="1">
+      <w:start w:val="1"/>
+      <w:numFmt w:val="bullet"/>
+      <w:lvlText w:val=""/>
+      <w:lvlJc w:val="left"/>
+      <w:pPr>
+        <w:ind w:left="5040" w:hanging="360"/>
+      </w:pPr>
+      <w:rPr>
+        <w:rFonts w:ascii="Symbol" w:hAnsi="Symbol" w:hint="default"/>
+      </w:rPr>
+    </w:lvl>
+    <w:lvl w:ilvl="7" w:tplc="04090003" w:tentative="1">
+      <w:start w:val="1"/>
+      <w:numFmt w:val="bullet"/>
+      <w:lvlText w:val="o"/>
+      <w:lvlJc w:val="left"/>
+      <w:pPr>
+        <w:ind w:left="5760" w:hanging="360"/>
+      </w:pPr>
+      <w:rPr>
+        <w:rFonts w:ascii="Courier New" w:hAnsi="Courier New" w:cs="Courier New" w:hint="default"/>
+      </w:rPr>
+    </w:lvl>
+    <w:lvl w:ilvl="8" w:tplc="04090005" w:tentative="1">
+      <w:start w:val="1"/>
+      <w:numFmt w:val="bullet"/>
+      <w:lvlText w:val=""/>
+      <w:lvlJc w:val="left"/>
+      <w:pPr>
+        <w:ind w:left="6480" w:hanging="360"/>
+      </w:pPr>
+      <w:rPr>
+        <w:rFonts w:ascii="Wingdings" w:hAnsi="Wingdings" w:hint="default"/>
+      </w:rPr>
+    </w:lvl>
+  </w:abstractNum>
+  <w:abstractNum w:abstractNumId="26" w15:restartNumberingAfterBreak="0">
     <w:nsid w:val="6EEA4873"/>
     <w:multiLevelType w:val="multilevel"/>
     <w:tmpl w:val="2DF2F524"/>
@@ -8033,7 +9201,61 @@
       </w:rPr>
     </w:lvl>
   </w:abstractNum>
-  <w:abstractNum w:abstractNumId="26" w15:restartNumberingAfterBreak="0">
+  <w:abstractNum w:abstractNumId="27" w15:restartNumberingAfterBreak="0">
+    <w:nsid w:val="6F8461C1"/>
+    <w:multiLevelType w:val="hybridMultilevel"/>
+    <w:tmpl w:val="E92CC2A2"/>
+    <w:lvl w:ilvl="0" w:tplc="746A6932">
+      <w:start w:val="1"/>
+      <w:numFmt w:val="bullet"/>
+      <w:lvlText w:val="•"/>
+      <w:lvlJc w:val="left"/>
+      <w:pPr>
+        <w:ind w:left="540" w:hanging="270"/>
+      </w:pPr>
+    </w:lvl>
+    <w:lvl w:ilvl="1" w:tplc="1A8E171C">
+      <w:numFmt w:val="decimal"/>
+      <w:lvlText w:val=""/>
+      <w:lvlJc w:val="left"/>
+    </w:lvl>
+    <w:lvl w:ilvl="2" w:tplc="DCD436F2">
+      <w:numFmt w:val="decimal"/>
+      <w:lvlText w:val=""/>
+      <w:lvlJc w:val="left"/>
+    </w:lvl>
+    <w:lvl w:ilvl="3" w:tplc="45006DF2">
+      <w:numFmt w:val="decimal"/>
+      <w:lvlText w:val=""/>
+      <w:lvlJc w:val="left"/>
+    </w:lvl>
+    <w:lvl w:ilvl="4" w:tplc="3626C32E">
+      <w:numFmt w:val="decimal"/>
+      <w:lvlText w:val=""/>
+      <w:lvlJc w:val="left"/>
+    </w:lvl>
+    <w:lvl w:ilvl="5" w:tplc="4C9A3004">
+      <w:numFmt w:val="decimal"/>
+      <w:lvlText w:val=""/>
+      <w:lvlJc w:val="left"/>
+    </w:lvl>
+    <w:lvl w:ilvl="6" w:tplc="71FAFD6A">
+      <w:numFmt w:val="decimal"/>
+      <w:lvlText w:val=""/>
+      <w:lvlJc w:val="left"/>
+    </w:lvl>
+    <w:lvl w:ilvl="7" w:tplc="89748814">
+      <w:numFmt w:val="decimal"/>
+      <w:lvlText w:val=""/>
+      <w:lvlJc w:val="left"/>
+    </w:lvl>
+    <w:lvl w:ilvl="8" w:tplc="ED5EE630">
+      <w:numFmt w:val="decimal"/>
+      <w:lvlText w:val=""/>
+      <w:lvlJc w:val="left"/>
+    </w:lvl>
+  </w:abstractNum>
+  <w:abstractNum w:abstractNumId="28" w15:restartNumberingAfterBreak="0">
     <w:nsid w:val="76207134"/>
     <w:multiLevelType w:val="multilevel"/>
     <w:tmpl w:val="64126ECC"/>
@@ -8182,7 +9404,7 @@
       </w:rPr>
     </w:lvl>
   </w:abstractNum>
-  <w:abstractNum w:abstractNumId="27" w15:restartNumberingAfterBreak="0">
+  <w:abstractNum w:abstractNumId="29" w15:restartNumberingAfterBreak="0">
     <w:nsid w:val="7FC21C41"/>
     <w:multiLevelType w:val="multilevel"/>
     <w:tmpl w:val="43A6BC78"/>
@@ -8341,7 +9563,7 @@
     <w:abstractNumId w:val="2"/>
   </w:num>
   <w:num w:numId="4" w16cid:durableId="1933119496">
-    <w:abstractNumId w:val="25"/>
+    <w:abstractNumId w:val="26"/>
   </w:num>
   <w:num w:numId="5" w16cid:durableId="702435699">
     <w:abstractNumId w:val="13"/>
@@ -8353,7 +9575,7 @@
     <w:abstractNumId w:val="3"/>
   </w:num>
   <w:num w:numId="8" w16cid:durableId="225839152">
-    <w:abstractNumId w:val="26"/>
+    <w:abstractNumId w:val="28"/>
   </w:num>
   <w:num w:numId="9" w16cid:durableId="1261184172">
     <w:abstractNumId w:val="1"/>
@@ -8395,7 +9617,7 @@
     <w:abstractNumId w:val="0"/>
   </w:num>
   <w:num w:numId="22" w16cid:durableId="1877615563">
-    <w:abstractNumId w:val="27"/>
+    <w:abstractNumId w:val="29"/>
   </w:num>
   <w:num w:numId="23" w16cid:durableId="1183741771">
     <w:abstractNumId w:val="18"/>
@@ -8441,6 +9663,15 @@
     <w:lvlOverride w:ilvl="8">
       <w:startOverride w:val="1"/>
     </w:lvlOverride>
+  </w:num>
+  <w:num w:numId="29" w16cid:durableId="335422172">
+    <w:abstractNumId w:val="27"/>
+    <w:lvlOverride w:ilvl="0">
+      <w:startOverride w:val="1"/>
+    </w:lvlOverride>
+  </w:num>
+  <w:num w:numId="30" w16cid:durableId="1889995101">
+    <w:abstractNumId w:val="25"/>
   </w:num>
 </w:numbering>
 </file>
@@ -8644,7 +9875,7 @@
     <w:lsdException w:name="Medium Shading 2 Accent 1" w:uiPriority="64"/>
     <w:lsdException w:name="Medium List 1 Accent 1" w:uiPriority="65"/>
     <w:lsdException w:name="Revision" w:semiHidden="1"/>
-    <w:lsdException w:name="List Paragraph" w:uiPriority="34" w:qFormat="1"/>
+    <w:lsdException w:name="List Paragraph" w:uiPriority="0" w:qFormat="1"/>
     <w:lsdException w:name="Quote" w:uiPriority="29" w:qFormat="1"/>
     <w:lsdException w:name="Intense Quote" w:uiPriority="30" w:qFormat="1"/>
     <w:lsdException w:name="Medium List 2 Accent 1" w:uiPriority="66"/>
@@ -9293,7 +10524,6 @@
   <w:style w:type="paragraph" w:styleId="ListParagraph">
     <w:name w:val="List Paragraph"/>
     <w:basedOn w:val="Normal"/>
-    <w:uiPriority w:val="34"/>
     <w:qFormat/>
     <w:rsid w:val="007E352C"/>
     <w:pPr>

</xml_diff>